<commit_message>
update: commit dont know
</commit_message>
<xml_diff>
--- a/WEEK 3/26MML0031_WEEK_3_EXERCISE.docx
+++ b/WEEK 3/26MML0031_WEEK_3_EXERCISE.docx
@@ -5198,6 +5198,9 @@
               </mc:AlternateContent>
             </w:r>
             <w:r>
+              <w:rPr>
+                <w:noProof/>
+              </w:rPr>
               <w:drawing>
                 <wp:anchor distT="0" distB="0" distL="114300" distR="114300" simplePos="0" relativeHeight="251658240" behindDoc="0" locked="0" layoutInCell="1" allowOverlap="1" wp14:anchorId="6DD2F8B1" wp14:editId="27190ECB">
                   <wp:simplePos x="0" y="0"/>
@@ -5376,6 +5379,9 @@
               </mc:AlternateContent>
             </w:r>
             <w:r>
+              <w:rPr>
+                <w:noProof/>
+              </w:rPr>
               <w:drawing>
                 <wp:anchor distT="0" distB="0" distL="114300" distR="114300" simplePos="0" relativeHeight="251661312" behindDoc="0" locked="0" layoutInCell="1" allowOverlap="1" wp14:anchorId="2AB18CA6" wp14:editId="26C8A535">
                   <wp:simplePos x="0" y="0"/>
@@ -5544,6 +5550,9 @@
               </mc:AlternateContent>
             </w:r>
             <w:r>
+              <w:rPr>
+                <w:noProof/>
+              </w:rPr>
               <w:drawing>
                 <wp:anchor distT="0" distB="0" distL="114300" distR="114300" simplePos="0" relativeHeight="251664384" behindDoc="0" locked="0" layoutInCell="1" allowOverlap="1" wp14:anchorId="45BCA83F" wp14:editId="4B95CD66">
                   <wp:simplePos x="0" y="0"/>
@@ -5712,6 +5721,9 @@
               </mc:AlternateContent>
             </w:r>
             <w:r>
+              <w:rPr>
+                <w:noProof/>
+              </w:rPr>
               <w:drawing>
                 <wp:anchor distT="0" distB="0" distL="114300" distR="114300" simplePos="0" relativeHeight="251667456" behindDoc="0" locked="0" layoutInCell="1" allowOverlap="1" wp14:anchorId="4723308A" wp14:editId="67112B0E">
                   <wp:simplePos x="0" y="0"/>
@@ -5881,6 +5893,9 @@
               </mc:AlternateContent>
             </w:r>
             <w:r>
+              <w:rPr>
+                <w:noProof/>
+              </w:rPr>
               <w:drawing>
                 <wp:anchor distT="0" distB="0" distL="114300" distR="114300" simplePos="0" relativeHeight="251670528" behindDoc="0" locked="0" layoutInCell="1" allowOverlap="1" wp14:anchorId="59FD7B22" wp14:editId="315FDF4A">
                   <wp:simplePos x="0" y="0"/>
@@ -6052,6 +6067,9 @@
               </mc:AlternateContent>
             </w:r>
             <w:r>
+              <w:rPr>
+                <w:noProof/>
+              </w:rPr>
               <w:drawing>
                 <wp:anchor distT="0" distB="0" distL="114300" distR="114300" simplePos="0" relativeHeight="251673600" behindDoc="0" locked="0" layoutInCell="1" allowOverlap="1" wp14:anchorId="7B9146DB" wp14:editId="5A266698">
                   <wp:simplePos x="0" y="0"/>
@@ -6273,6 +6291,9 @@
               </mc:AlternateContent>
             </w:r>
             <w:r>
+              <w:rPr>
+                <w:noProof/>
+              </w:rPr>
               <w:drawing>
                 <wp:anchor distT="0" distB="0" distL="114300" distR="114300" simplePos="0" relativeHeight="251676672" behindDoc="0" locked="0" layoutInCell="1" allowOverlap="1" wp14:anchorId="5F39C2E9" wp14:editId="7653195F">
                   <wp:simplePos x="0" y="0"/>
@@ -6440,10 +6461,7 @@
               <w:spacing w:after="20"/>
             </w:pPr>
             <w:r>
-              <w:t>1</w:t>
-            </w:r>
-            <w:r>
-              <w:t>. NumPy documentation for array creation, descriptive statistics, slicing, reshaping, aggregation, and element-wise operations.</w:t>
+              <w:t>1. NumPy documentation for array creation, descriptive statistics, slicing, reshaping, aggregation, and element-wise operations.</w:t>
             </w:r>
           </w:p>
           <w:p>
@@ -6451,10 +6469,7 @@
               <w:spacing w:after="20"/>
             </w:pPr>
             <w:r>
-              <w:t>2</w:t>
-            </w:r>
-            <w:r>
-              <w:t>. Pandas documentation for DataFrame creation and warehouse performance reporting.</w:t>
+              <w:t>2. Pandas documentation for DataFrame creation and warehouse performance reporting.</w:t>
             </w:r>
           </w:p>
           <w:p>
@@ -6468,7 +6483,21 @@
               <w:t xml:space="preserve"> </w:t>
             </w:r>
             <w:r>
-              <w:t>()</w:t>
+              <w:t>(</w:t>
+            </w:r>
+            <w:hyperlink r:id="rId15" w:history="1">
+              <w:r>
+                <w:rPr>
+                  <w:rStyle w:val="Hyperlink"/>
+                </w:rPr>
+                <w:t>https://github.com/hasnainmakada-99/Data-Science-Codes/blob/main/WEEK%203/EXERCISE_PROGRAM.py</w:t>
+              </w:r>
+            </w:hyperlink>
+            <w:r>
+              <w:t>)</w:t>
+            </w:r>
+            <w:r>
+              <w:t xml:space="preserve"> </w:t>
             </w:r>
           </w:p>
         </w:tc>
@@ -6482,8 +6511,12 @@
       </w:pPr>
     </w:p>
     <w:sectPr>
-      <w:headerReference w:type="default" r:id="rId15"/>
-      <w:footerReference w:type="default" r:id="rId16"/>
+      <w:headerReference w:type="even" r:id="rId16"/>
+      <w:headerReference w:type="default" r:id="rId17"/>
+      <w:footerReference w:type="even" r:id="rId18"/>
+      <w:footerReference w:type="default" r:id="rId19"/>
+      <w:headerReference w:type="first" r:id="rId20"/>
+      <w:footerReference w:type="first" r:id="rId21"/>
       <w:pgSz w:w="11906" w:h="16838"/>
       <w:pgMar w:top="1440" w:right="1440" w:bottom="1440" w:left="1440" w:header="708" w:footer="708" w:gutter="0"/>
       <w:pgBorders w:offsetFrom="page">
@@ -6529,6 +6562,16 @@
   <w:p>
     <w:pPr>
       <w:pStyle w:val="Footer"/>
+    </w:pPr>
+  </w:p>
+</w:ftr>
+</file>
+
+<file path=word/footer2.xml><?xml version="1.0" encoding="utf-8"?>
+<w:ftr xmlns:wpc="http://schemas.microsoft.com/office/word/2010/wordprocessingCanvas" xmlns:cx="http://schemas.microsoft.com/office/drawing/2014/chartex" xmlns:cx1="http://schemas.microsoft.com/office/drawing/2015/9/8/chartex" xmlns:cx2="http://schemas.microsoft.com/office/drawing/2015/10/21/chartex" xmlns:cx3="http://schemas.microsoft.com/office/drawing/2016/5/9/chartex" xmlns:cx4="http://schemas.microsoft.com/office/drawing/2016/5/10/chartex" xmlns:cx5="http://schemas.microsoft.com/office/drawing/2016/5/11/chartex" xmlns:cx6="http://schemas.microsoft.com/office/drawing/2016/5/12/chartex" xmlns:cx7="http://schemas.microsoft.com/office/drawing/2016/5/13/chartex" xmlns:cx8="http://schemas.microsoft.com/office/drawing/2016/5/14/chartex" xmlns:mc="http://schemas.openxmlformats.org/markup-compatibility/2006" xmlns:aink="http://schemas.microsoft.com/office/drawing/2016/ink" xmlns:am3d="http://schemas.microsoft.com/office/drawing/2017/model3d" xmlns:o="urn:schemas-microsoft-com:office:office" xmlns:oel="http://schemas.microsoft.com/office/2019/extlst" xmlns:r="http://schemas.openxmlformats.org/officeDocument/2006/relationships" xmlns:m="http://schemas.openxmlformats.org/officeDocument/2006/math" xmlns:v="urn:schemas-microsoft-com:vml" xmlns:wp14="http://schemas.microsoft.com/office/word/2010/wordprocessingDrawing" xmlns:wp="http://schemas.openxmlformats.org/drawingml/2006/wordprocessingDrawing" xmlns:w10="urn:schemas-microsoft-com:office:word" xmlns:w="http://schemas.openxmlformats.org/wordprocessingml/2006/main" xmlns:w14="http://schemas.microsoft.com/office/word/2010/wordml" xmlns:w15="http://schemas.microsoft.com/office/word/2012/wordml" xmlns:w16cei="http://schemas.microsoft.com/office/word/2026/wordml/cei" xmlns:w16cex="http://schemas.microsoft.com/office/word/2018/wordml/cex" xmlns:w16cid="http://schemas.microsoft.com/office/word/2016/wordml/cid" xmlns:w16="http://schemas.microsoft.com/office/word/2018/wordml" xmlns:w16du="http://schemas.microsoft.com/office/word/2023/wordml/word16du" xmlns:w16sdtdh="http://schemas.microsoft.com/office/word/2020/wordml/sdtdatahash" xmlns:w16sdtfl="http://schemas.microsoft.com/office/word/2024/wordml/sdtformatlock" xmlns:w16se="http://schemas.microsoft.com/office/word/2015/wordml/symex" xmlns:wpg="http://schemas.microsoft.com/office/word/2010/wordprocessingGroup" xmlns:wpi="http://schemas.microsoft.com/office/word/2010/wordprocessingInk" xmlns:wne="http://schemas.microsoft.com/office/word/2006/wordml" xmlns:wps="http://schemas.microsoft.com/office/word/2010/wordprocessingShape" mc:Ignorable="w14 w15 w16se w16cid w16 w16cex w16sdtdh w16sdtfl w16du wp14">
+  <w:p>
+    <w:pPr>
+      <w:pStyle w:val="Footer"/>
       <w:rPr>
         <w:lang w:val="en-US"/>
       </w:rPr>
@@ -6537,14 +6580,26 @@
       <w:rPr>
         <w:sz w:val="20"/>
       </w:rPr>
-      <w:t>Student Reg. No.: __________________________</w:t>
+      <w:t xml:space="preserve">Student Reg. No.: </w:t>
+    </w:r>
+    <w:r>
+      <w:rPr>
+        <w:sz w:val="20"/>
+      </w:rPr>
+      <w:t>26MML0031</w:t>
     </w:r>
     <w:r>
       <w:rPr>
         <w:sz w:val="20"/>
       </w:rPr>
       <w:tab/>
-      <w:t>Name: ______________________________</w:t>
+      <w:t>Name:</w:t>
+    </w:r>
+    <w:r>
+      <w:rPr>
+        <w:sz w:val="20"/>
+      </w:rPr>
+      <w:t xml:space="preserve"> Makada Hasnain Husainbhai</w:t>
     </w:r>
   </w:p>
   <w:p>
@@ -6659,6 +6714,16 @@
 </w:ftr>
 </file>
 
+<file path=word/footer3.xml><?xml version="1.0" encoding="utf-8"?>
+<w:ftr xmlns:wpc="http://schemas.microsoft.com/office/word/2010/wordprocessingCanvas" xmlns:cx="http://schemas.microsoft.com/office/drawing/2014/chartex" xmlns:cx1="http://schemas.microsoft.com/office/drawing/2015/9/8/chartex" xmlns:cx2="http://schemas.microsoft.com/office/drawing/2015/10/21/chartex" xmlns:cx3="http://schemas.microsoft.com/office/drawing/2016/5/9/chartex" xmlns:cx4="http://schemas.microsoft.com/office/drawing/2016/5/10/chartex" xmlns:cx5="http://schemas.microsoft.com/office/drawing/2016/5/11/chartex" xmlns:cx6="http://schemas.microsoft.com/office/drawing/2016/5/12/chartex" xmlns:cx7="http://schemas.microsoft.com/office/drawing/2016/5/13/chartex" xmlns:cx8="http://schemas.microsoft.com/office/drawing/2016/5/14/chartex" xmlns:mc="http://schemas.openxmlformats.org/markup-compatibility/2006" xmlns:aink="http://schemas.microsoft.com/office/drawing/2016/ink" xmlns:am3d="http://schemas.microsoft.com/office/drawing/2017/model3d" xmlns:o="urn:schemas-microsoft-com:office:office" xmlns:oel="http://schemas.microsoft.com/office/2019/extlst" xmlns:r="http://schemas.openxmlformats.org/officeDocument/2006/relationships" xmlns:m="http://schemas.openxmlformats.org/officeDocument/2006/math" xmlns:v="urn:schemas-microsoft-com:vml" xmlns:wp14="http://schemas.microsoft.com/office/word/2010/wordprocessingDrawing" xmlns:wp="http://schemas.openxmlformats.org/drawingml/2006/wordprocessingDrawing" xmlns:w10="urn:schemas-microsoft-com:office:word" xmlns:w="http://schemas.openxmlformats.org/wordprocessingml/2006/main" xmlns:w14="http://schemas.microsoft.com/office/word/2010/wordml" xmlns:w15="http://schemas.microsoft.com/office/word/2012/wordml" xmlns:w16cei="http://schemas.microsoft.com/office/word/2026/wordml/cei" xmlns:w16cex="http://schemas.microsoft.com/office/word/2018/wordml/cex" xmlns:w16cid="http://schemas.microsoft.com/office/word/2016/wordml/cid" xmlns:w16="http://schemas.microsoft.com/office/word/2018/wordml" xmlns:w16du="http://schemas.microsoft.com/office/word/2023/wordml/word16du" xmlns:w16sdtdh="http://schemas.microsoft.com/office/word/2020/wordml/sdtdatahash" xmlns:w16sdtfl="http://schemas.microsoft.com/office/word/2024/wordml/sdtformatlock" xmlns:w16se="http://schemas.microsoft.com/office/word/2015/wordml/symex" xmlns:wpg="http://schemas.microsoft.com/office/word/2010/wordprocessingGroup" xmlns:wpi="http://schemas.microsoft.com/office/word/2010/wordprocessingInk" xmlns:wne="http://schemas.microsoft.com/office/word/2006/wordml" xmlns:wps="http://schemas.microsoft.com/office/word/2010/wordprocessingShape" mc:Ignorable="w14 w15 w16se w16cid w16 w16cex w16sdtdh w16sdtfl w16du wp14">
+  <w:p>
+    <w:pPr>
+      <w:pStyle w:val="Footer"/>
+    </w:pPr>
+  </w:p>
+</w:ftr>
+</file>
+
 <file path=word/footnotes.xml><?xml version="1.0" encoding="utf-8"?>
 <w:footnotes xmlns:wpc="http://schemas.microsoft.com/office/word/2010/wordprocessingCanvas" xmlns:cx="http://schemas.microsoft.com/office/drawing/2014/chartex" xmlns:cx1="http://schemas.microsoft.com/office/drawing/2015/9/8/chartex" xmlns:cx2="http://schemas.microsoft.com/office/drawing/2015/10/21/chartex" xmlns:cx3="http://schemas.microsoft.com/office/drawing/2016/5/9/chartex" xmlns:cx4="http://schemas.microsoft.com/office/drawing/2016/5/10/chartex" xmlns:cx5="http://schemas.microsoft.com/office/drawing/2016/5/11/chartex" xmlns:cx6="http://schemas.microsoft.com/office/drawing/2016/5/12/chartex" xmlns:cx7="http://schemas.microsoft.com/office/drawing/2016/5/13/chartex" xmlns:cx8="http://schemas.microsoft.com/office/drawing/2016/5/14/chartex" xmlns:mc="http://schemas.openxmlformats.org/markup-compatibility/2006" xmlns:aink="http://schemas.microsoft.com/office/drawing/2016/ink" xmlns:am3d="http://schemas.microsoft.com/office/drawing/2017/model3d" xmlns:o="urn:schemas-microsoft-com:office:office" xmlns:oel="http://schemas.microsoft.com/office/2019/extlst" xmlns:r="http://schemas.openxmlformats.org/officeDocument/2006/relationships" xmlns:m="http://schemas.openxmlformats.org/officeDocument/2006/math" xmlns:v="urn:schemas-microsoft-com:vml" xmlns:wp14="http://schemas.microsoft.com/office/word/2010/wordprocessingDrawing" xmlns:wp="http://schemas.openxmlformats.org/drawingml/2006/wordprocessingDrawing" xmlns:w10="urn:schemas-microsoft-com:office:word" xmlns:w="http://schemas.openxmlformats.org/wordprocessingml/2006/main" xmlns:w14="http://schemas.microsoft.com/office/word/2010/wordml" xmlns:w15="http://schemas.microsoft.com/office/word/2012/wordml" xmlns:w16cei="http://schemas.microsoft.com/office/word/2026/wordml/cei" xmlns:w16cex="http://schemas.microsoft.com/office/word/2018/wordml/cex" xmlns:w16cid="http://schemas.microsoft.com/office/word/2016/wordml/cid" xmlns:w16="http://schemas.microsoft.com/office/word/2018/wordml" xmlns:w16du="http://schemas.microsoft.com/office/word/2023/wordml/word16du" xmlns:w16sdtdh="http://schemas.microsoft.com/office/word/2020/wordml/sdtdatahash" xmlns:w16sdtfl="http://schemas.microsoft.com/office/word/2024/wordml/sdtformatlock" xmlns:w16se="http://schemas.microsoft.com/office/word/2015/wordml/symex" xmlns:wpg="http://schemas.microsoft.com/office/word/2010/wordprocessingGroup" xmlns:wpi="http://schemas.microsoft.com/office/word/2010/wordprocessingInk" xmlns:wne="http://schemas.microsoft.com/office/word/2006/wordml" xmlns:wps="http://schemas.microsoft.com/office/word/2010/wordprocessingShape" mc:Ignorable="w14 w15 w16se w16cid w16 w16cex w16sdtdh w16sdtfl w16du wp14">
   <w:footnote w:type="separator" w:id="-1">
@@ -6685,6 +6750,16 @@
 </file>
 
 <file path=word/header1.xml><?xml version="1.0" encoding="utf-8"?>
+<w:hdr xmlns:wpc="http://schemas.microsoft.com/office/word/2010/wordprocessingCanvas" xmlns:cx="http://schemas.microsoft.com/office/drawing/2014/chartex" xmlns:cx1="http://schemas.microsoft.com/office/drawing/2015/9/8/chartex" xmlns:cx2="http://schemas.microsoft.com/office/drawing/2015/10/21/chartex" xmlns:cx3="http://schemas.microsoft.com/office/drawing/2016/5/9/chartex" xmlns:cx4="http://schemas.microsoft.com/office/drawing/2016/5/10/chartex" xmlns:cx5="http://schemas.microsoft.com/office/drawing/2016/5/11/chartex" xmlns:cx6="http://schemas.microsoft.com/office/drawing/2016/5/12/chartex" xmlns:cx7="http://schemas.microsoft.com/office/drawing/2016/5/13/chartex" xmlns:cx8="http://schemas.microsoft.com/office/drawing/2016/5/14/chartex" xmlns:mc="http://schemas.openxmlformats.org/markup-compatibility/2006" xmlns:aink="http://schemas.microsoft.com/office/drawing/2016/ink" xmlns:am3d="http://schemas.microsoft.com/office/drawing/2017/model3d" xmlns:o="urn:schemas-microsoft-com:office:office" xmlns:oel="http://schemas.microsoft.com/office/2019/extlst" xmlns:r="http://schemas.openxmlformats.org/officeDocument/2006/relationships" xmlns:m="http://schemas.openxmlformats.org/officeDocument/2006/math" xmlns:v="urn:schemas-microsoft-com:vml" xmlns:wp14="http://schemas.microsoft.com/office/word/2010/wordprocessingDrawing" xmlns:wp="http://schemas.openxmlformats.org/drawingml/2006/wordprocessingDrawing" xmlns:w10="urn:schemas-microsoft-com:office:word" xmlns:w="http://schemas.openxmlformats.org/wordprocessingml/2006/main" xmlns:w14="http://schemas.microsoft.com/office/word/2010/wordml" xmlns:w15="http://schemas.microsoft.com/office/word/2012/wordml" xmlns:w16cei="http://schemas.microsoft.com/office/word/2026/wordml/cei" xmlns:w16cex="http://schemas.microsoft.com/office/word/2018/wordml/cex" xmlns:w16cid="http://schemas.microsoft.com/office/word/2016/wordml/cid" xmlns:w16="http://schemas.microsoft.com/office/word/2018/wordml" xmlns:w16du="http://schemas.microsoft.com/office/word/2023/wordml/word16du" xmlns:w16sdtdh="http://schemas.microsoft.com/office/word/2020/wordml/sdtdatahash" xmlns:w16sdtfl="http://schemas.microsoft.com/office/word/2024/wordml/sdtformatlock" xmlns:w16se="http://schemas.microsoft.com/office/word/2015/wordml/symex" xmlns:wpg="http://schemas.microsoft.com/office/word/2010/wordprocessingGroup" xmlns:wpi="http://schemas.microsoft.com/office/word/2010/wordprocessingInk" xmlns:wne="http://schemas.microsoft.com/office/word/2006/wordml" xmlns:wps="http://schemas.microsoft.com/office/word/2010/wordprocessingShape" mc:Ignorable="w14 w15 w16se w16cid w16 w16cex w16sdtdh w16sdtfl w16du wp14">
+  <w:p>
+    <w:pPr>
+      <w:pStyle w:val="Header"/>
+    </w:pPr>
+  </w:p>
+</w:hdr>
+</file>
+
+<file path=word/header2.xml><?xml version="1.0" encoding="utf-8"?>
 <w:hdr xmlns:wpc="http://schemas.microsoft.com/office/word/2010/wordprocessingCanvas" xmlns:cx="http://schemas.microsoft.com/office/drawing/2014/chartex" xmlns:cx1="http://schemas.microsoft.com/office/drawing/2015/9/8/chartex" xmlns:cx2="http://schemas.microsoft.com/office/drawing/2015/10/21/chartex" xmlns:cx3="http://schemas.microsoft.com/office/drawing/2016/5/9/chartex" xmlns:cx4="http://schemas.microsoft.com/office/drawing/2016/5/10/chartex" xmlns:cx5="http://schemas.microsoft.com/office/drawing/2016/5/11/chartex" xmlns:cx6="http://schemas.microsoft.com/office/drawing/2016/5/12/chartex" xmlns:cx7="http://schemas.microsoft.com/office/drawing/2016/5/13/chartex" xmlns:cx8="http://schemas.microsoft.com/office/drawing/2016/5/14/chartex" xmlns:mc="http://schemas.openxmlformats.org/markup-compatibility/2006" xmlns:aink="http://schemas.microsoft.com/office/drawing/2016/ink" xmlns:am3d="http://schemas.microsoft.com/office/drawing/2017/model3d" xmlns:o="urn:schemas-microsoft-com:office:office" xmlns:oel="http://schemas.microsoft.com/office/2019/extlst" xmlns:r="http://schemas.openxmlformats.org/officeDocument/2006/relationships" xmlns:m="http://schemas.openxmlformats.org/officeDocument/2006/math" xmlns:v="urn:schemas-microsoft-com:vml" xmlns:wp14="http://schemas.microsoft.com/office/word/2010/wordprocessingDrawing" xmlns:wp="http://schemas.openxmlformats.org/drawingml/2006/wordprocessingDrawing" xmlns:w10="urn:schemas-microsoft-com:office:word" xmlns:w="http://schemas.openxmlformats.org/wordprocessingml/2006/main" xmlns:w14="http://schemas.microsoft.com/office/word/2010/wordml" xmlns:w15="http://schemas.microsoft.com/office/word/2012/wordml" xmlns:w16cei="http://schemas.microsoft.com/office/word/2026/wordml/cei" xmlns:w16cex="http://schemas.microsoft.com/office/word/2018/wordml/cex" xmlns:w16cid="http://schemas.microsoft.com/office/word/2016/wordml/cid" xmlns:w16="http://schemas.microsoft.com/office/word/2018/wordml" xmlns:w16du="http://schemas.microsoft.com/office/word/2023/wordml/word16du" xmlns:w16sdtdh="http://schemas.microsoft.com/office/word/2020/wordml/sdtdatahash" xmlns:w16sdtfl="http://schemas.microsoft.com/office/word/2024/wordml/sdtformatlock" xmlns:w16se="http://schemas.microsoft.com/office/word/2015/wordml/symex" xmlns:wpg="http://schemas.microsoft.com/office/word/2010/wordprocessingGroup" xmlns:wpi="http://schemas.microsoft.com/office/word/2010/wordprocessingInk" xmlns:wne="http://schemas.microsoft.com/office/word/2006/wordml" xmlns:wps="http://schemas.microsoft.com/office/word/2010/wordprocessingShape" mc:Ignorable="w14 w15 w16se w16cid w16 w16cex w16sdtdh w16sdtfl w16du wp14">
   <w:p>
     <w:pPr>
@@ -6795,6 +6870,16 @@
       </w:rPr>
       <w:t>6</w:t>
     </w:r>
+  </w:p>
+</w:hdr>
+</file>
+
+<file path=word/header3.xml><?xml version="1.0" encoding="utf-8"?>
+<w:hdr xmlns:wpc="http://schemas.microsoft.com/office/word/2010/wordprocessingCanvas" xmlns:cx="http://schemas.microsoft.com/office/drawing/2014/chartex" xmlns:cx1="http://schemas.microsoft.com/office/drawing/2015/9/8/chartex" xmlns:cx2="http://schemas.microsoft.com/office/drawing/2015/10/21/chartex" xmlns:cx3="http://schemas.microsoft.com/office/drawing/2016/5/9/chartex" xmlns:cx4="http://schemas.microsoft.com/office/drawing/2016/5/10/chartex" xmlns:cx5="http://schemas.microsoft.com/office/drawing/2016/5/11/chartex" xmlns:cx6="http://schemas.microsoft.com/office/drawing/2016/5/12/chartex" xmlns:cx7="http://schemas.microsoft.com/office/drawing/2016/5/13/chartex" xmlns:cx8="http://schemas.microsoft.com/office/drawing/2016/5/14/chartex" xmlns:mc="http://schemas.openxmlformats.org/markup-compatibility/2006" xmlns:aink="http://schemas.microsoft.com/office/drawing/2016/ink" xmlns:am3d="http://schemas.microsoft.com/office/drawing/2017/model3d" xmlns:o="urn:schemas-microsoft-com:office:office" xmlns:oel="http://schemas.microsoft.com/office/2019/extlst" xmlns:r="http://schemas.openxmlformats.org/officeDocument/2006/relationships" xmlns:m="http://schemas.openxmlformats.org/officeDocument/2006/math" xmlns:v="urn:schemas-microsoft-com:vml" xmlns:wp14="http://schemas.microsoft.com/office/word/2010/wordprocessingDrawing" xmlns:wp="http://schemas.openxmlformats.org/drawingml/2006/wordprocessingDrawing" xmlns:w10="urn:schemas-microsoft-com:office:word" xmlns:w="http://schemas.openxmlformats.org/wordprocessingml/2006/main" xmlns:w14="http://schemas.microsoft.com/office/word/2010/wordml" xmlns:w15="http://schemas.microsoft.com/office/word/2012/wordml" xmlns:w16cei="http://schemas.microsoft.com/office/word/2026/wordml/cei" xmlns:w16cex="http://schemas.microsoft.com/office/word/2018/wordml/cex" xmlns:w16cid="http://schemas.microsoft.com/office/word/2016/wordml/cid" xmlns:w16="http://schemas.microsoft.com/office/word/2018/wordml" xmlns:w16du="http://schemas.microsoft.com/office/word/2023/wordml/word16du" xmlns:w16sdtdh="http://schemas.microsoft.com/office/word/2020/wordml/sdtdatahash" xmlns:w16sdtfl="http://schemas.microsoft.com/office/word/2024/wordml/sdtformatlock" xmlns:w16se="http://schemas.microsoft.com/office/word/2015/wordml/symex" xmlns:wpg="http://schemas.microsoft.com/office/word/2010/wordprocessingGroup" xmlns:wpi="http://schemas.microsoft.com/office/word/2010/wordprocessingInk" xmlns:wne="http://schemas.microsoft.com/office/word/2006/wordml" xmlns:wps="http://schemas.microsoft.com/office/word/2010/wordprocessingShape" mc:Ignorable="w14 w15 w16se w16cid w16 w16cex w16sdtdh w16sdtfl w16du wp14">
+  <w:p>
+    <w:pPr>
+      <w:pStyle w:val="Header"/>
+    </w:pPr>
   </w:p>
 </w:hdr>
 </file>
@@ -8648,6 +8733,18 @@
       <w:u w:val="single"/>
     </w:rPr>
   </w:style>
+  <w:style w:type="character" w:styleId="UnresolvedMention">
+    <w:name w:val="Unresolved Mention"/>
+    <w:basedOn w:val="DefaultParagraphFont"/>
+    <w:uiPriority w:val="99"/>
+    <w:semiHidden/>
+    <w:unhideWhenUsed/>
+    <w:rsid w:val="00C85A0B"/>
+    <w:rPr>
+      <w:color w:val="605E5C"/>
+      <w:shd w:val="clear" w:color="auto" w:fill="E1DFDD"/>
+    </w:rPr>
+  </w:style>
 </w:styles>
 </file>
 

</xml_diff>